<commit_message>
Update manuscript metadata with final author details
</commit_message>
<xml_diff>
--- a/docs/manuscripts/target_journal_packages/jamia_open_submission/title_page_jamia_open.docx
+++ b/docs/manuscripts/target_journal_packages/jamia_open_submission/title_page_jamia_open.docx
@@ -2,7 +2,7 @@
 <file path=word/document.xml><?xml version="1.0" encoding="utf-8"?>
 <w:document xmlns:w="http://schemas.openxmlformats.org/wordprocessingml/2006/main" xmlns:m="http://schemas.openxmlformats.org/officeDocument/2006/math" xmlns:r="http://schemas.openxmlformats.org/officeDocument/2006/relationships" xmlns:o="urn:schemas-microsoft-com:office:office" xmlns:v="urn:schemas-microsoft-com:vml" xmlns:w10="urn:schemas-microsoft-com:office:word" xmlns:a="http://schemas.openxmlformats.org/drawingml/2006/main" xmlns:pic="http://schemas.openxmlformats.org/drawingml/2006/picture" xmlns:wp="http://schemas.openxmlformats.org/drawingml/2006/wordprocessingDrawing">
   <w:body>
-    <w:bookmarkStart w:id="22" w:name="title-page"/>
+    <w:bookmarkStart w:id="23" w:name="title-page"/>
     <w:p>
       <w:pPr>
         <w:pStyle w:val="Heading1"/>
@@ -79,7 +79,7 @@
         <w:pStyle w:val="FirstParagraph"/>
       </w:pPr>
       <w:r>
-        <w:t xml:space="preserve">Dr. Siddalingaiah H S, Project SentinelCare, Bengaluru, India</w:t>
+        <w:t xml:space="preserve">Dr Siddalingaiah H S, Professor, Community Medicine, Shridevi Institute of Medical Sciences and Research Hospital, Tumkur</w:t>
       </w:r>
     </w:p>
     <w:bookmarkEnd w:id="12"/>
@@ -97,19 +97,19 @@
         <w:pStyle w:val="FirstParagraph"/>
       </w:pPr>
       <w:r>
-        <w:t xml:space="preserve">Dr. Siddalingaiah H S</w:t>
+        <w:t xml:space="preserve">Dr Siddalingaiah H S</w:t>
       </w:r>
       <w:r>
         <w:br/>
       </w:r>
       <w:r>
-        <w:t xml:space="preserve">Project SentinelCare</w:t>
+        <w:t xml:space="preserve">Professor, Community Medicine</w:t>
       </w:r>
       <w:r>
         <w:br/>
       </w:r>
       <w:r>
-        <w:t xml:space="preserve">Bengaluru, India</w:t>
+        <w:t xml:space="preserve">Shridevi Institute of Medical Sciences and Research Hospital, Tumkur</w:t>
       </w:r>
       <w:r>
         <w:br/>
@@ -121,16 +121,34 @@
         <w:br/>
       </w:r>
       <w:r>
-        <w:t xml:space="preserve">To be supplied in journal submission portal</w:t>
+        <w:t xml:space="preserve">8941087719</w:t>
       </w:r>
     </w:p>
     <w:bookmarkEnd w:id="13"/>
-    <w:bookmarkStart w:id="14" w:name="keywords"/>
+    <w:bookmarkStart w:id="14" w:name="orcid"/>
     <w:p>
       <w:pPr>
         <w:pStyle w:val="Heading2"/>
       </w:pPr>
       <w:r>
+        <w:t xml:space="preserve">ORCID</w:t>
+      </w:r>
+    </w:p>
+    <w:p>
+      <w:pPr>
+        <w:pStyle w:val="FirstParagraph"/>
+      </w:pPr>
+      <w:r>
+        <w:t xml:space="preserve">0000-0002-4771-8285</w:t>
+      </w:r>
+    </w:p>
+    <w:bookmarkEnd w:id="14"/>
+    <w:bookmarkStart w:id="15" w:name="keywords"/>
+    <w:p>
+      <w:pPr>
+        <w:pStyle w:val="Heading2"/>
+      </w:pPr>
+      <w:r>
         <w:t xml:space="preserve">Keywords</w:t>
       </w:r>
     </w:p>
@@ -142,8 +160,8 @@
         <w:t xml:space="preserve">patient safety; clinical decision support; diagnostic safety; sepsis surveillance; medication safety; health informatics</w:t>
       </w:r>
     </w:p>
-    <w:bookmarkEnd w:id="14"/>
-    <w:bookmarkStart w:id="15" w:name="word-counts"/>
+    <w:bookmarkEnd w:id="15"/>
+    <w:bookmarkStart w:id="16" w:name="word-counts"/>
     <w:p>
       <w:pPr>
         <w:pStyle w:val="Heading2"/>
@@ -191,8 +209,8 @@
         <w:t xml:space="preserve">limit of 4000 words excluding references and acknowledgments</w:t>
       </w:r>
     </w:p>
-    <w:bookmarkEnd w:id="15"/>
-    <w:bookmarkStart w:id="16" w:name="tables-and-figures"/>
+    <w:bookmarkEnd w:id="16"/>
+    <w:bookmarkStart w:id="17" w:name="tables-and-figures"/>
     <w:p>
       <w:pPr>
         <w:pStyle w:val="Heading2"/>
@@ -225,8 +243,8 @@
         <w:t xml:space="preserve">Figures: 3</w:t>
       </w:r>
     </w:p>
-    <w:bookmarkEnd w:id="16"/>
-    <w:bookmarkStart w:id="17" w:name="data-and-code"/>
+    <w:bookmarkEnd w:id="17"/>
+    <w:bookmarkStart w:id="18" w:name="data-and-code"/>
     <w:p>
       <w:pPr>
         <w:pStyle w:val="Heading2"/>
@@ -259,8 +277,8 @@
         <w:t xml:space="preserve">Data availability statement included in manuscript</w:t>
       </w:r>
     </w:p>
-    <w:bookmarkEnd w:id="17"/>
-    <w:bookmarkStart w:id="18" w:name="funding"/>
+    <w:bookmarkEnd w:id="18"/>
+    <w:bookmarkStart w:id="19" w:name="funding"/>
     <w:p>
       <w:pPr>
         <w:pStyle w:val="Heading2"/>
@@ -277,8 +295,8 @@
         <w:t xml:space="preserve">No specific external funding was received for this framework development, manuscript preparation, or prototype implementation work.</w:t>
       </w:r>
     </w:p>
-    <w:bookmarkEnd w:id="18"/>
-    <w:bookmarkStart w:id="19" w:name="conflict-of-interest"/>
+    <w:bookmarkEnd w:id="19"/>
+    <w:bookmarkStart w:id="20" w:name="conflict-of-interest"/>
     <w:p>
       <w:pPr>
         <w:pStyle w:val="Heading2"/>
@@ -292,11 +310,11 @@
         <w:pStyle w:val="FirstParagraph"/>
       </w:pPr>
       <w:r>
-        <w:t xml:space="preserve">Dr. Siddalingaiah H S is the lead architect and maintainer of the SentinelCare concept, manuscripts, and prototype repository. No commercial product revenue is reported for the work described in this manuscript.</w:t>
-      </w:r>
-    </w:p>
-    <w:bookmarkEnd w:id="19"/>
-    <w:bookmarkStart w:id="20" w:name="prior-presentation"/>
+        <w:t xml:space="preserve">Dr Siddalingaiah H S is the lead architect and maintainer of the SentinelCare concept, manuscripts, and prototype repository. No commercial product revenue is reported for the work described in this manuscript.</w:t>
+      </w:r>
+    </w:p>
+    <w:bookmarkEnd w:id="20"/>
+    <w:bookmarkStart w:id="21" w:name="prior-presentation"/>
     <w:p>
       <w:pPr>
         <w:pStyle w:val="Heading2"/>
@@ -313,8 +331,8 @@
         <w:t xml:space="preserve">None.</w:t>
       </w:r>
     </w:p>
-    <w:bookmarkEnd w:id="20"/>
-    <w:bookmarkStart w:id="21" w:name="ai-use-disclosure"/>
+    <w:bookmarkEnd w:id="21"/>
+    <w:bookmarkStart w:id="22" w:name="ai-use-disclosure"/>
     <w:p>
       <w:pPr>
         <w:pStyle w:val="Heading2"/>
@@ -339,8 +357,8 @@
         <w:t xml:space="preserve">“Generative AI assistance was used for drafting support and language editing under direct human supervision. The author reviewed and verified all factual statements, references, interpretations, and final manuscript text.”</w:t>
       </w:r>
     </w:p>
-    <w:bookmarkEnd w:id="21"/>
     <w:bookmarkEnd w:id="22"/>
+    <w:bookmarkEnd w:id="23"/>
     <w:sectPr>
       <w:footnotePr>
         <w:numRestart w:val="eachSect"/>

</xml_diff>